<commit_message>
docs: update SRS introduction and scope
</commit_message>
<xml_diff>
--- a/SRS_DevTrackAI.docx
+++ b/SRS_DevTrackAI.docx
@@ -1403,6 +1403,1997 @@
         <w:t>9. Risks, Constraints, and Appendix</w:t>
       </w:r>
     </w:p>
+    <w:p>
+      <w:r>
+        <w:br w:type="page"/>
+      </w:r>
+    </w:p>
+    <w:p>
+      <w:pPr>
+        <w:pStyle w:val="Heading1"/>
+      </w:pPr>
+      <w:r>
+        <w:t>1. Project Overview</w:t>
+      </w:r>
+    </w:p>
+    <w:p>
+      <w:pPr>
+        <w:pStyle w:val="Heading2"/>
+      </w:pPr>
+      <w:r>
+        <w:t>1.1 Introduction</w:t>
+      </w:r>
+    </w:p>
+    <w:p>
+      <w:pPr>
+        <w:spacing w:before="0" w:after="120" w:line="269" w:lineRule="auto"/>
+      </w:pPr>
+      <w:r>
+        <w:rPr>
+          <w:rFonts w:ascii="Calibri" w:hAnsi="Calibri" w:eastAsia="Calibri"/>
+          <w:sz w:val="21"/>
+        </w:rPr>
+        <w:t>DevTrack AI is an AI-integrated project workspace designed for IT student teams working on course projects, capstone projects, or semester-based software products. The system focuses on managing the project process with requirement traceability, evidence-based progress tracking, testing visibility, and weekly reporting.</w:t>
+      </w:r>
+    </w:p>
+    <w:p>
+      <w:pPr>
+        <w:spacing w:before="0" w:after="120" w:line="269" w:lineRule="auto"/>
+      </w:pPr>
+      <w:r>
+        <w:rPr>
+          <w:rFonts w:ascii="Calibri" w:hAnsi="Calibri" w:eastAsia="Calibri"/>
+          <w:sz w:val="21"/>
+        </w:rPr>
+        <w:t>Unlike a general task board, DevTrack AI does not only answer the question of who is doing which task. It is intended to help a team prove whether a requirement has been implemented, tested, linked to valid evidence, affected by open defects, and reflected in project reports.</w:t>
+      </w:r>
+    </w:p>
+    <w:p>
+      <w:pPr>
+        <w:pStyle w:val="Heading2"/>
+      </w:pPr>
+      <w:r>
+        <w:t>1.2 Purpose</w:t>
+      </w:r>
+    </w:p>
+    <w:p>
+      <w:pPr>
+        <w:spacing w:before="0" w:after="120" w:line="269" w:lineRule="auto"/>
+      </w:pPr>
+      <w:r>
+        <w:rPr>
+          <w:rFonts w:ascii="Calibri" w:hAnsi="Calibri" w:eastAsia="Calibri"/>
+          <w:sz w:val="21"/>
+        </w:rPr>
+        <w:t>The purpose of this SRS is to define the functional and non-functional expectations for DevTrack AI. This document clarifies the system scope, user roles, existing system gaps, and the proposed direction for building a project workspace that supports academic software development in a more transparent and traceable way.</w:t>
+      </w:r>
+    </w:p>
+    <w:p>
+      <w:pPr>
+        <w:pStyle w:val="Heading2"/>
+      </w:pPr>
+      <w:r>
+        <w:t>1.3 Problem Statement</w:t>
+      </w:r>
+    </w:p>
+    <w:p>
+      <w:pPr>
+        <w:spacing w:before="0" w:after="120" w:line="269" w:lineRule="auto"/>
+      </w:pPr>
+      <w:r>
+        <w:rPr>
+          <w:rFonts w:ascii="Calibri" w:hAnsi="Calibri" w:eastAsia="Calibri"/>
+          <w:sz w:val="21"/>
+        </w:rPr>
+        <w:t>Student teams often manage requirements, tasks, testing, evidence, GitHub activity, and weekly reports in separate tools. This creates weak traceability and makes it difficult for leaders and mentors to verify whether project progress is real, complete, and supported by proper evidence. In many cases, testing is performed late, evidence is uploaded without review, and AI-generated work is not recorded transparently.</w:t>
+      </w:r>
+    </w:p>
+    <w:p>
+      <w:pPr>
+        <w:pStyle w:val="Heading2"/>
+      </w:pPr>
+      <w:r>
+        <w:t>1.4 Project Objectives</w:t>
+      </w:r>
+    </w:p>
+    <w:p>
+      <w:pPr>
+        <w:pStyle w:val="ListBullet"/>
+        <w:spacing w:after="80" w:line="264" w:lineRule="auto"/>
+      </w:pPr>
+      <w:r>
+        <w:rPr>
+          <w:rFonts w:ascii="Calibri" w:hAnsi="Calibri" w:eastAsia="Calibri"/>
+          <w:sz w:val="20"/>
+        </w:rPr>
+        <w:t>Provide a structured workspace for project, requirement, task, sprint, test case, bug, evidence, RTM, and report management.</w:t>
+      </w:r>
+    </w:p>
+    <w:p>
+      <w:pPr>
+        <w:pStyle w:val="ListBullet"/>
+        <w:spacing w:after="80" w:line="264" w:lineRule="auto"/>
+      </w:pPr>
+      <w:r>
+        <w:rPr>
+          <w:rFonts w:ascii="Calibri" w:hAnsi="Calibri" w:eastAsia="Calibri"/>
+          <w:sz w:val="20"/>
+        </w:rPr>
+        <w:t>Support requirement traceability from requirement to use case, task, test case, defect, evidence, GitHub activity, and report.</w:t>
+      </w:r>
+    </w:p>
+    <w:p>
+      <w:pPr>
+        <w:pStyle w:val="ListBullet"/>
+        <w:spacing w:after="80" w:line="264" w:lineRule="auto"/>
+      </w:pPr>
+      <w:r>
+        <w:rPr>
+          <w:rFonts w:ascii="Calibri" w:hAnsi="Calibri" w:eastAsia="Calibri"/>
+          <w:sz w:val="20"/>
+        </w:rPr>
+        <w:t>Help leaders and mentors identify missing artifacts such as tasks without requirements, requirements without test cases, or completed tasks without accepted evidence.</w:t>
+      </w:r>
+    </w:p>
+    <w:p>
+      <w:pPr>
+        <w:pStyle w:val="ListBullet"/>
+        <w:spacing w:after="80" w:line="264" w:lineRule="auto"/>
+      </w:pPr>
+      <w:r>
+        <w:rPr>
+          <w:rFonts w:ascii="Calibri" w:hAnsi="Calibri" w:eastAsia="Calibri"/>
+          <w:sz w:val="20"/>
+        </w:rPr>
+        <w:t>Use AI as a support layer for draft tasks, draft test cases, missing-artifact suggestions, and weekly report drafts while keeping human review mandatory.</w:t>
+      </w:r>
+    </w:p>
+    <w:p>
+      <w:pPr>
+        <w:pStyle w:val="ListBullet"/>
+        <w:spacing w:after="80" w:line="264" w:lineRule="auto"/>
+      </w:pPr>
+      <w:r>
+        <w:rPr>
+          <w:rFonts w:ascii="Calibri" w:hAnsi="Calibri" w:eastAsia="Calibri"/>
+          <w:sz w:val="20"/>
+        </w:rPr>
+        <w:t>Improve transparency of student contribution by combining task progress, evidence, testing activity, and GitHub metadata instead of relying only on commit count.</w:t>
+      </w:r>
+    </w:p>
+    <w:p>
+      <w:pPr>
+        <w:pStyle w:val="Heading2"/>
+      </w:pPr>
+      <w:r>
+        <w:t>1.5 Target Users</w:t>
+      </w:r>
+    </w:p>
+    <w:tbl>
+      <w:tblPr>
+        <w:tblStyle w:val="TableGrid"/>
+        <w:tblW w:type="auto" w:w="0"/>
+        <w:jc w:val="center"/>
+        <w:tblLayout w:type="fixed"/>
+        <w:tblLook w:firstColumn="1" w:firstRow="1" w:lastColumn="0" w:lastRow="0" w:noHBand="0" w:noVBand="1" w:val="04A0"/>
+      </w:tblPr>
+      <w:tblGrid>
+        <w:gridCol w:w="3264"/>
+        <w:gridCol w:w="3264"/>
+        <w:gridCol w:w="3264"/>
+      </w:tblGrid>
+      <w:tr>
+        <w:trPr>
+          <w:tblHeader w:val="true"/>
+        </w:trPr>
+        <w:tc>
+          <w:tcPr>
+            <w:tcW w:type="dxa" w:w="1944"/>
+            <w:shd w:fill="E8EEF5"/>
+            <w:vAlign w:val="center"/>
+          </w:tcPr>
+          <w:p>
+            <w:pPr>
+              <w:spacing w:after="0" w:line="252" w:lineRule="auto"/>
+            </w:pPr>
+            <w:r/>
+            <w:r>
+              <w:rPr>
+                <w:rFonts w:ascii="Calibri" w:hAnsi="Calibri" w:eastAsia="Calibri"/>
+                <w:b/>
+                <w:color w:val="0B2545"/>
+                <w:sz w:val="18"/>
+              </w:rPr>
+              <w:t>User Group</w:t>
+            </w:r>
+          </w:p>
+        </w:tc>
+        <w:tc>
+          <w:tcPr>
+            <w:tcW w:type="dxa" w:w="3096"/>
+            <w:shd w:fill="E8EEF5"/>
+            <w:vAlign w:val="center"/>
+          </w:tcPr>
+          <w:p>
+            <w:pPr>
+              <w:spacing w:after="0" w:line="252" w:lineRule="auto"/>
+            </w:pPr>
+            <w:r/>
+            <w:r>
+              <w:rPr>
+                <w:rFonts w:ascii="Calibri" w:hAnsi="Calibri" w:eastAsia="Calibri"/>
+                <w:b/>
+                <w:color w:val="0B2545"/>
+                <w:sz w:val="18"/>
+              </w:rPr>
+              <w:t>Description</w:t>
+            </w:r>
+          </w:p>
+        </w:tc>
+        <w:tc>
+          <w:tcPr>
+            <w:tcW w:type="dxa" w:w="4320"/>
+            <w:shd w:fill="E8EEF5"/>
+            <w:vAlign w:val="center"/>
+          </w:tcPr>
+          <w:p>
+            <w:pPr>
+              <w:spacing w:after="0" w:line="252" w:lineRule="auto"/>
+            </w:pPr>
+            <w:r/>
+            <w:r>
+              <w:rPr>
+                <w:rFonts w:ascii="Calibri" w:hAnsi="Calibri" w:eastAsia="Calibri"/>
+                <w:b/>
+                <w:color w:val="0B2545"/>
+                <w:sz w:val="18"/>
+              </w:rPr>
+              <w:t>Main Needs</w:t>
+            </w:r>
+          </w:p>
+        </w:tc>
+      </w:tr>
+      <w:tr>
+        <w:tc>
+          <w:tcPr>
+            <w:tcW w:type="dxa" w:w="1944"/>
+            <w:shd w:fill="FFFFFF"/>
+            <w:vAlign w:val="center"/>
+          </w:tcPr>
+          <w:p>
+            <w:pPr>
+              <w:spacing w:after="0" w:line="252" w:lineRule="auto"/>
+            </w:pPr>
+            <w:r/>
+            <w:r>
+              <w:rPr>
+                <w:rFonts w:ascii="Calibri" w:hAnsi="Calibri" w:eastAsia="Calibri"/>
+                <w:b w:val="0"/>
+                <w:sz w:val="18"/>
+              </w:rPr>
+              <w:t>Project Leader</w:t>
+            </w:r>
+          </w:p>
+        </w:tc>
+        <w:tc>
+          <w:tcPr>
+            <w:tcW w:type="dxa" w:w="3096"/>
+            <w:shd w:fill="FFFFFF"/>
+            <w:vAlign w:val="center"/>
+          </w:tcPr>
+          <w:p>
+            <w:pPr>
+              <w:spacing w:after="0" w:line="252" w:lineRule="auto"/>
+            </w:pPr>
+            <w:r/>
+            <w:r>
+              <w:rPr>
+                <w:rFonts w:ascii="Calibri" w:hAnsi="Calibri" w:eastAsia="Calibri"/>
+                <w:b w:val="0"/>
+                <w:sz w:val="18"/>
+              </w:rPr>
+              <w:t>Student responsible for coordinating the team project.</w:t>
+            </w:r>
+          </w:p>
+        </w:tc>
+        <w:tc>
+          <w:tcPr>
+            <w:tcW w:type="dxa" w:w="4320"/>
+            <w:shd w:fill="FFFFFF"/>
+            <w:vAlign w:val="center"/>
+          </w:tcPr>
+          <w:p>
+            <w:pPr>
+              <w:spacing w:after="0" w:line="252" w:lineRule="auto"/>
+            </w:pPr>
+            <w:r/>
+            <w:r>
+              <w:rPr>
+                <w:rFonts w:ascii="Calibri" w:hAnsi="Calibri" w:eastAsia="Calibri"/>
+                <w:b w:val="0"/>
+                <w:sz w:val="18"/>
+              </w:rPr>
+              <w:t>Manage requirements, assign tasks, review evidence, monitor RTM, and generate reports.</w:t>
+            </w:r>
+          </w:p>
+        </w:tc>
+      </w:tr>
+      <w:tr>
+        <w:tc>
+          <w:tcPr>
+            <w:tcW w:type="dxa" w:w="1944"/>
+            <w:shd w:fill="FFFFFF"/>
+            <w:vAlign w:val="center"/>
+          </w:tcPr>
+          <w:p>
+            <w:pPr>
+              <w:spacing w:after="0" w:line="252" w:lineRule="auto"/>
+            </w:pPr>
+            <w:r/>
+            <w:r>
+              <w:rPr>
+                <w:rFonts w:ascii="Calibri" w:hAnsi="Calibri" w:eastAsia="Calibri"/>
+                <w:b w:val="0"/>
+                <w:sz w:val="18"/>
+              </w:rPr>
+              <w:t>Team Member</w:t>
+            </w:r>
+          </w:p>
+        </w:tc>
+        <w:tc>
+          <w:tcPr>
+            <w:tcW w:type="dxa" w:w="3096"/>
+            <w:shd w:fill="FFFFFF"/>
+            <w:vAlign w:val="center"/>
+          </w:tcPr>
+          <w:p>
+            <w:pPr>
+              <w:spacing w:after="0" w:line="252" w:lineRule="auto"/>
+            </w:pPr>
+            <w:r/>
+            <w:r>
+              <w:rPr>
+                <w:rFonts w:ascii="Calibri" w:hAnsi="Calibri" w:eastAsia="Calibri"/>
+                <w:b w:val="0"/>
+                <w:sz w:val="18"/>
+              </w:rPr>
+              <w:t>Student who implements, tests, documents, or supports project work.</w:t>
+            </w:r>
+          </w:p>
+        </w:tc>
+        <w:tc>
+          <w:tcPr>
+            <w:tcW w:type="dxa" w:w="4320"/>
+            <w:shd w:fill="FFFFFF"/>
+            <w:vAlign w:val="center"/>
+          </w:tcPr>
+          <w:p>
+            <w:pPr>
+              <w:spacing w:after="0" w:line="252" w:lineRule="auto"/>
+            </w:pPr>
+            <w:r/>
+            <w:r>
+              <w:rPr>
+                <w:rFonts w:ascii="Calibri" w:hAnsi="Calibri" w:eastAsia="Calibri"/>
+                <w:b w:val="0"/>
+                <w:sz w:val="18"/>
+              </w:rPr>
+              <w:t>View assigned tasks, update progress, create tests/bugs, upload evidence, and track personal contribution.</w:t>
+            </w:r>
+          </w:p>
+        </w:tc>
+      </w:tr>
+      <w:tr>
+        <w:tc>
+          <w:tcPr>
+            <w:tcW w:type="dxa" w:w="1944"/>
+            <w:shd w:fill="FFFFFF"/>
+            <w:vAlign w:val="center"/>
+          </w:tcPr>
+          <w:p>
+            <w:pPr>
+              <w:spacing w:after="0" w:line="252" w:lineRule="auto"/>
+            </w:pPr>
+            <w:r/>
+            <w:r>
+              <w:rPr>
+                <w:rFonts w:ascii="Calibri" w:hAnsi="Calibri" w:eastAsia="Calibri"/>
+                <w:b w:val="0"/>
+                <w:sz w:val="18"/>
+              </w:rPr>
+              <w:t>Mentor / Supervisor</w:t>
+            </w:r>
+          </w:p>
+        </w:tc>
+        <w:tc>
+          <w:tcPr>
+            <w:tcW w:type="dxa" w:w="3096"/>
+            <w:shd w:fill="FFFFFF"/>
+            <w:vAlign w:val="center"/>
+          </w:tcPr>
+          <w:p>
+            <w:pPr>
+              <w:spacing w:after="0" w:line="252" w:lineRule="auto"/>
+            </w:pPr>
+            <w:r/>
+            <w:r>
+              <w:rPr>
+                <w:rFonts w:ascii="Calibri" w:hAnsi="Calibri" w:eastAsia="Calibri"/>
+                <w:b w:val="0"/>
+                <w:sz w:val="18"/>
+              </w:rPr>
+              <w:t>Instructor or mentor who reviews project progress.</w:t>
+            </w:r>
+          </w:p>
+        </w:tc>
+        <w:tc>
+          <w:tcPr>
+            <w:tcW w:type="dxa" w:w="4320"/>
+            <w:shd w:fill="FFFFFF"/>
+            <w:vAlign w:val="center"/>
+          </w:tcPr>
+          <w:p>
+            <w:pPr>
+              <w:spacing w:after="0" w:line="252" w:lineRule="auto"/>
+            </w:pPr>
+            <w:r/>
+            <w:r>
+              <w:rPr>
+                <w:rFonts w:ascii="Calibri" w:hAnsi="Calibri" w:eastAsia="Calibri"/>
+                <w:b w:val="0"/>
+                <w:sz w:val="18"/>
+              </w:rPr>
+              <w:t>View project overview, RTM, evidence, weekly reports, and contribution indicators without directly editing project data.</w:t>
+            </w:r>
+          </w:p>
+        </w:tc>
+      </w:tr>
+      <w:tr>
+        <w:tc>
+          <w:tcPr>
+            <w:tcW w:type="dxa" w:w="1944"/>
+            <w:shd w:fill="FFFFFF"/>
+            <w:vAlign w:val="center"/>
+          </w:tcPr>
+          <w:p>
+            <w:pPr>
+              <w:spacing w:after="0" w:line="252" w:lineRule="auto"/>
+            </w:pPr>
+            <w:r/>
+            <w:r>
+              <w:rPr>
+                <w:rFonts w:ascii="Calibri" w:hAnsi="Calibri" w:eastAsia="Calibri"/>
+                <w:b w:val="0"/>
+                <w:sz w:val="18"/>
+              </w:rPr>
+              <w:t>Admin</w:t>
+            </w:r>
+          </w:p>
+        </w:tc>
+        <w:tc>
+          <w:tcPr>
+            <w:tcW w:type="dxa" w:w="3096"/>
+            <w:shd w:fill="FFFFFF"/>
+            <w:vAlign w:val="center"/>
+          </w:tcPr>
+          <w:p>
+            <w:pPr>
+              <w:spacing w:after="0" w:line="252" w:lineRule="auto"/>
+            </w:pPr>
+            <w:r/>
+            <w:r>
+              <w:rPr>
+                <w:rFonts w:ascii="Calibri" w:hAnsi="Calibri" w:eastAsia="Calibri"/>
+                <w:b w:val="0"/>
+                <w:sz w:val="18"/>
+              </w:rPr>
+              <w:t>System-level administrator.</w:t>
+            </w:r>
+          </w:p>
+        </w:tc>
+        <w:tc>
+          <w:tcPr>
+            <w:tcW w:type="dxa" w:w="4320"/>
+            <w:shd w:fill="FFFFFF"/>
+            <w:vAlign w:val="center"/>
+          </w:tcPr>
+          <w:p>
+            <w:pPr>
+              <w:spacing w:after="0" w:line="252" w:lineRule="auto"/>
+            </w:pPr>
+            <w:r/>
+            <w:r>
+              <w:rPr>
+                <w:rFonts w:ascii="Calibri" w:hAnsi="Calibri" w:eastAsia="Calibri"/>
+                <w:b w:val="0"/>
+                <w:sz w:val="18"/>
+              </w:rPr>
+              <w:t>Manage users, projects, configuration, storage rules, AI provider settings, and system activity.</w:t>
+            </w:r>
+          </w:p>
+        </w:tc>
+      </w:tr>
+    </w:tbl>
+    <w:p>
+      <w:pPr>
+        <w:spacing w:after="40"/>
+      </w:pPr>
+    </w:p>
+    <w:p>
+      <w:pPr>
+        <w:pStyle w:val="Heading1"/>
+      </w:pPr>
+      <w:r>
+        <w:t>2. Product Scope</w:t>
+      </w:r>
+    </w:p>
+    <w:p>
+      <w:pPr>
+        <w:pStyle w:val="Heading2"/>
+      </w:pPr>
+      <w:r>
+        <w:t>2.1 In-Scope Features for MVP</w:t>
+      </w:r>
+    </w:p>
+    <w:tbl>
+      <w:tblPr>
+        <w:tblStyle w:val="TableGrid"/>
+        <w:tblW w:type="auto" w:w="0"/>
+        <w:jc w:val="center"/>
+        <w:tblLayout w:type="fixed"/>
+        <w:tblLook w:firstColumn="1" w:firstRow="1" w:lastColumn="0" w:lastRow="0" w:noHBand="0" w:noVBand="1" w:val="04A0"/>
+      </w:tblPr>
+      <w:tblGrid>
+        <w:gridCol w:w="4896"/>
+        <w:gridCol w:w="4896"/>
+      </w:tblGrid>
+      <w:tr>
+        <w:trPr>
+          <w:tblHeader w:val="true"/>
+        </w:trPr>
+        <w:tc>
+          <w:tcPr>
+            <w:tcW w:type="dxa" w:w="2951"/>
+            <w:shd w:fill="E8EEF5"/>
+            <w:vAlign w:val="center"/>
+          </w:tcPr>
+          <w:p>
+            <w:pPr>
+              <w:spacing w:after="0" w:line="252" w:lineRule="auto"/>
+            </w:pPr>
+            <w:r/>
+            <w:r>
+              <w:rPr>
+                <w:rFonts w:ascii="Calibri" w:hAnsi="Calibri" w:eastAsia="Calibri"/>
+                <w:b/>
+                <w:color w:val="0B2545"/>
+                <w:sz w:val="18"/>
+              </w:rPr>
+              <w:t>Module</w:t>
+            </w:r>
+          </w:p>
+        </w:tc>
+        <w:tc>
+          <w:tcPr>
+            <w:tcW w:type="dxa" w:w="6408"/>
+            <w:shd w:fill="E8EEF5"/>
+            <w:vAlign w:val="center"/>
+          </w:tcPr>
+          <w:p>
+            <w:pPr>
+              <w:spacing w:after="0" w:line="252" w:lineRule="auto"/>
+            </w:pPr>
+            <w:r/>
+            <w:r>
+              <w:rPr>
+                <w:rFonts w:ascii="Calibri" w:hAnsi="Calibri" w:eastAsia="Calibri"/>
+                <w:b/>
+                <w:color w:val="0B2545"/>
+                <w:sz w:val="18"/>
+              </w:rPr>
+              <w:t>Scope Description</w:t>
+            </w:r>
+          </w:p>
+        </w:tc>
+      </w:tr>
+      <w:tr>
+        <w:tc>
+          <w:tcPr>
+            <w:tcW w:type="dxa" w:w="2951"/>
+            <w:shd w:fill="FFFFFF"/>
+            <w:vAlign w:val="center"/>
+          </w:tcPr>
+          <w:p>
+            <w:pPr>
+              <w:spacing w:after="0" w:line="252" w:lineRule="auto"/>
+            </w:pPr>
+            <w:r/>
+            <w:r>
+              <w:rPr>
+                <w:rFonts w:ascii="Calibri" w:hAnsi="Calibri" w:eastAsia="Calibri"/>
+                <w:b w:val="0"/>
+                <w:sz w:val="18"/>
+              </w:rPr>
+              <w:t>Authentication and Invitation</w:t>
+            </w:r>
+          </w:p>
+        </w:tc>
+        <w:tc>
+          <w:tcPr>
+            <w:tcW w:type="dxa" w:w="6408"/>
+            <w:shd w:fill="FFFFFF"/>
+            <w:vAlign w:val="center"/>
+          </w:tcPr>
+          <w:p>
+            <w:pPr>
+              <w:spacing w:after="0" w:line="252" w:lineRule="auto"/>
+            </w:pPr>
+            <w:r/>
+            <w:r>
+              <w:rPr>
+                <w:rFonts w:ascii="Calibri" w:hAnsi="Calibri" w:eastAsia="Calibri"/>
+                <w:b w:val="0"/>
+                <w:sz w:val="18"/>
+              </w:rPr>
+              <w:t>Login, registration, project invitation, and basic role-based access.</w:t>
+            </w:r>
+          </w:p>
+        </w:tc>
+      </w:tr>
+      <w:tr>
+        <w:tc>
+          <w:tcPr>
+            <w:tcW w:type="dxa" w:w="2951"/>
+            <w:shd w:fill="FFFFFF"/>
+            <w:vAlign w:val="center"/>
+          </w:tcPr>
+          <w:p>
+            <w:pPr>
+              <w:spacing w:after="0" w:line="252" w:lineRule="auto"/>
+            </w:pPr>
+            <w:r/>
+            <w:r>
+              <w:rPr>
+                <w:rFonts w:ascii="Calibri" w:hAnsi="Calibri" w:eastAsia="Calibri"/>
+                <w:b w:val="0"/>
+                <w:sz w:val="18"/>
+              </w:rPr>
+              <w:t>Project Workspace</w:t>
+            </w:r>
+          </w:p>
+        </w:tc>
+        <w:tc>
+          <w:tcPr>
+            <w:tcW w:type="dxa" w:w="6408"/>
+            <w:shd w:fill="FFFFFF"/>
+            <w:vAlign w:val="center"/>
+          </w:tcPr>
+          <w:p>
+            <w:pPr>
+              <w:spacing w:after="0" w:line="252" w:lineRule="auto"/>
+            </w:pPr>
+            <w:r/>
+            <w:r>
+              <w:rPr>
+                <w:rFonts w:ascii="Calibri" w:hAnsi="Calibri" w:eastAsia="Calibri"/>
+                <w:b w:val="0"/>
+                <w:sz w:val="18"/>
+              </w:rPr>
+              <w:t>Project list, project dashboard, member list, and high-level progress overview.</w:t>
+            </w:r>
+          </w:p>
+        </w:tc>
+      </w:tr>
+      <w:tr>
+        <w:tc>
+          <w:tcPr>
+            <w:tcW w:type="dxa" w:w="2951"/>
+            <w:shd w:fill="FFFFFF"/>
+            <w:vAlign w:val="center"/>
+          </w:tcPr>
+          <w:p>
+            <w:pPr>
+              <w:spacing w:after="0" w:line="252" w:lineRule="auto"/>
+            </w:pPr>
+            <w:r/>
+            <w:r>
+              <w:rPr>
+                <w:rFonts w:ascii="Calibri" w:hAnsi="Calibri" w:eastAsia="Calibri"/>
+                <w:b w:val="0"/>
+                <w:sz w:val="18"/>
+              </w:rPr>
+              <w:t>Requirement Management</w:t>
+            </w:r>
+          </w:p>
+        </w:tc>
+        <w:tc>
+          <w:tcPr>
+            <w:tcW w:type="dxa" w:w="6408"/>
+            <w:shd w:fill="FFFFFF"/>
+            <w:vAlign w:val="center"/>
+          </w:tcPr>
+          <w:p>
+            <w:pPr>
+              <w:spacing w:after="0" w:line="252" w:lineRule="auto"/>
+            </w:pPr>
+            <w:r/>
+            <w:r>
+              <w:rPr>
+                <w:rFonts w:ascii="Calibri" w:hAnsi="Calibri" w:eastAsia="Calibri"/>
+                <w:b w:val="0"/>
+                <w:sz w:val="18"/>
+              </w:rPr>
+              <w:t>Create official requirements with acceptance criteria, priority, owner, and evidence-required flag.</w:t>
+            </w:r>
+          </w:p>
+        </w:tc>
+      </w:tr>
+      <w:tr>
+        <w:tc>
+          <w:tcPr>
+            <w:tcW w:type="dxa" w:w="2951"/>
+            <w:shd w:fill="FFFFFF"/>
+            <w:vAlign w:val="center"/>
+          </w:tcPr>
+          <w:p>
+            <w:pPr>
+              <w:spacing w:after="0" w:line="252" w:lineRule="auto"/>
+            </w:pPr>
+            <w:r/>
+            <w:r>
+              <w:rPr>
+                <w:rFonts w:ascii="Calibri" w:hAnsi="Calibri" w:eastAsia="Calibri"/>
+                <w:b w:val="0"/>
+                <w:sz w:val="18"/>
+              </w:rPr>
+              <w:t>Use Case Management</w:t>
+            </w:r>
+          </w:p>
+        </w:tc>
+        <w:tc>
+          <w:tcPr>
+            <w:tcW w:type="dxa" w:w="6408"/>
+            <w:shd w:fill="FFFFFF"/>
+            <w:vAlign w:val="center"/>
+          </w:tcPr>
+          <w:p>
+            <w:pPr>
+              <w:spacing w:after="0" w:line="252" w:lineRule="auto"/>
+            </w:pPr>
+            <w:r/>
+            <w:r>
+              <w:rPr>
+                <w:rFonts w:ascii="Calibri" w:hAnsi="Calibri" w:eastAsia="Calibri"/>
+                <w:b w:val="0"/>
+                <w:sz w:val="18"/>
+              </w:rPr>
+              <w:t>Describe actor, precondition, main flow, alternative flow, and link use cases to requirements.</w:t>
+            </w:r>
+          </w:p>
+        </w:tc>
+      </w:tr>
+      <w:tr>
+        <w:tc>
+          <w:tcPr>
+            <w:tcW w:type="dxa" w:w="2951"/>
+            <w:shd w:fill="FFFFFF"/>
+            <w:vAlign w:val="center"/>
+          </w:tcPr>
+          <w:p>
+            <w:pPr>
+              <w:spacing w:after="0" w:line="252" w:lineRule="auto"/>
+            </w:pPr>
+            <w:r/>
+            <w:r>
+              <w:rPr>
+                <w:rFonts w:ascii="Calibri" w:hAnsi="Calibri" w:eastAsia="Calibri"/>
+                <w:b w:val="0"/>
+                <w:sz w:val="18"/>
+              </w:rPr>
+              <w:t>Task and Sprint Management</w:t>
+            </w:r>
+          </w:p>
+        </w:tc>
+        <w:tc>
+          <w:tcPr>
+            <w:tcW w:type="dxa" w:w="6408"/>
+            <w:shd w:fill="FFFFFF"/>
+            <w:vAlign w:val="center"/>
+          </w:tcPr>
+          <w:p>
+            <w:pPr>
+              <w:spacing w:after="0" w:line="252" w:lineRule="auto"/>
+            </w:pPr>
+            <w:r/>
+            <w:r>
+              <w:rPr>
+                <w:rFonts w:ascii="Calibri" w:hAnsi="Calibri" w:eastAsia="Calibri"/>
+                <w:b w:val="0"/>
+                <w:sz w:val="18"/>
+              </w:rPr>
+              <w:t>Create tasks, assign members, update status, organize tasks by sprint, and view Kanban board.</w:t>
+            </w:r>
+          </w:p>
+        </w:tc>
+      </w:tr>
+      <w:tr>
+        <w:tc>
+          <w:tcPr>
+            <w:tcW w:type="dxa" w:w="2951"/>
+            <w:shd w:fill="FFFFFF"/>
+            <w:vAlign w:val="center"/>
+          </w:tcPr>
+          <w:p>
+            <w:pPr>
+              <w:spacing w:after="0" w:line="252" w:lineRule="auto"/>
+            </w:pPr>
+            <w:r/>
+            <w:r>
+              <w:rPr>
+                <w:rFonts w:ascii="Calibri" w:hAnsi="Calibri" w:eastAsia="Calibri"/>
+                <w:b w:val="0"/>
+                <w:sz w:val="18"/>
+              </w:rPr>
+              <w:t>Test Case and Bug Management</w:t>
+            </w:r>
+          </w:p>
+        </w:tc>
+        <w:tc>
+          <w:tcPr>
+            <w:tcW w:type="dxa" w:w="6408"/>
+            <w:shd w:fill="FFFFFF"/>
+            <w:vAlign w:val="center"/>
+          </w:tcPr>
+          <w:p>
+            <w:pPr>
+              <w:spacing w:after="0" w:line="252" w:lineRule="auto"/>
+            </w:pPr>
+            <w:r/>
+            <w:r>
+              <w:rPr>
+                <w:rFonts w:ascii="Calibri" w:hAnsi="Calibri" w:eastAsia="Calibri"/>
+                <w:b w:val="0"/>
+                <w:sz w:val="18"/>
+              </w:rPr>
+              <w:t>Create test cases, record pass/fail/blocked execution, and create lightweight defects when tests fail.</w:t>
+            </w:r>
+          </w:p>
+        </w:tc>
+      </w:tr>
+      <w:tr>
+        <w:tc>
+          <w:tcPr>
+            <w:tcW w:type="dxa" w:w="2951"/>
+            <w:shd w:fill="FFFFFF"/>
+            <w:vAlign w:val="center"/>
+          </w:tcPr>
+          <w:p>
+            <w:pPr>
+              <w:spacing w:after="0" w:line="252" w:lineRule="auto"/>
+            </w:pPr>
+            <w:r/>
+            <w:r>
+              <w:rPr>
+                <w:rFonts w:ascii="Calibri" w:hAnsi="Calibri" w:eastAsia="Calibri"/>
+                <w:b w:val="0"/>
+                <w:sz w:val="18"/>
+              </w:rPr>
+              <w:t>Evidence Vault</w:t>
+            </w:r>
+          </w:p>
+        </w:tc>
+        <w:tc>
+          <w:tcPr>
+            <w:tcW w:type="dxa" w:w="6408"/>
+            <w:shd w:fill="FFFFFF"/>
+            <w:vAlign w:val="center"/>
+          </w:tcPr>
+          <w:p>
+            <w:pPr>
+              <w:spacing w:after="0" w:line="252" w:lineRule="auto"/>
+            </w:pPr>
+            <w:r/>
+            <w:r>
+              <w:rPr>
+                <w:rFonts w:ascii="Calibri" w:hAnsi="Calibri" w:eastAsia="Calibri"/>
+                <w:b w:val="0"/>
+                <w:sz w:val="18"/>
+              </w:rPr>
+              <w:t>Upload or link evidence, review evidence status, and count only accepted evidence in RTM.</w:t>
+            </w:r>
+          </w:p>
+        </w:tc>
+      </w:tr>
+      <w:tr>
+        <w:tc>
+          <w:tcPr>
+            <w:tcW w:type="dxa" w:w="2951"/>
+            <w:shd w:fill="FFFFFF"/>
+            <w:vAlign w:val="center"/>
+          </w:tcPr>
+          <w:p>
+            <w:pPr>
+              <w:spacing w:after="0" w:line="252" w:lineRule="auto"/>
+            </w:pPr>
+            <w:r/>
+            <w:r>
+              <w:rPr>
+                <w:rFonts w:ascii="Calibri" w:hAnsi="Calibri" w:eastAsia="Calibri"/>
+                <w:b w:val="0"/>
+                <w:sz w:val="18"/>
+              </w:rPr>
+              <w:t>RTM</w:t>
+            </w:r>
+          </w:p>
+        </w:tc>
+        <w:tc>
+          <w:tcPr>
+            <w:tcW w:type="dxa" w:w="6408"/>
+            <w:shd w:fill="FFFFFF"/>
+            <w:vAlign w:val="center"/>
+          </w:tcPr>
+          <w:p>
+            <w:pPr>
+              <w:spacing w:after="0" w:line="252" w:lineRule="auto"/>
+            </w:pPr>
+            <w:r/>
+            <w:r>
+              <w:rPr>
+                <w:rFonts w:ascii="Calibri" w:hAnsi="Calibri" w:eastAsia="Calibri"/>
+                <w:b w:val="0"/>
+                <w:sz w:val="18"/>
+              </w:rPr>
+              <w:t>Generate requirement traceability matrix from requirement, task, test, bug, and evidence data.</w:t>
+            </w:r>
+          </w:p>
+        </w:tc>
+      </w:tr>
+      <w:tr>
+        <w:tc>
+          <w:tcPr>
+            <w:tcW w:type="dxa" w:w="2951"/>
+            <w:shd w:fill="FFFFFF"/>
+            <w:vAlign w:val="center"/>
+          </w:tcPr>
+          <w:p>
+            <w:pPr>
+              <w:spacing w:after="0" w:line="252" w:lineRule="auto"/>
+            </w:pPr>
+            <w:r/>
+            <w:r>
+              <w:rPr>
+                <w:rFonts w:ascii="Calibri" w:hAnsi="Calibri" w:eastAsia="Calibri"/>
+                <w:b w:val="0"/>
+                <w:sz w:val="18"/>
+              </w:rPr>
+              <w:t>AI Assistant</w:t>
+            </w:r>
+          </w:p>
+        </w:tc>
+        <w:tc>
+          <w:tcPr>
+            <w:tcW w:type="dxa" w:w="6408"/>
+            <w:shd w:fill="FFFFFF"/>
+            <w:vAlign w:val="center"/>
+          </w:tcPr>
+          <w:p>
+            <w:pPr>
+              <w:spacing w:after="0" w:line="252" w:lineRule="auto"/>
+            </w:pPr>
+            <w:r/>
+            <w:r>
+              <w:rPr>
+                <w:rFonts w:ascii="Calibri" w:hAnsi="Calibri" w:eastAsia="Calibri"/>
+                <w:b w:val="0"/>
+                <w:sz w:val="18"/>
+              </w:rPr>
+              <w:t>Generate draft tasks, suggest test cases, detect missing artifacts, and create weekly report drafts.</w:t>
+            </w:r>
+          </w:p>
+        </w:tc>
+      </w:tr>
+      <w:tr>
+        <w:tc>
+          <w:tcPr>
+            <w:tcW w:type="dxa" w:w="2951"/>
+            <w:shd w:fill="FFFFFF"/>
+            <w:vAlign w:val="center"/>
+          </w:tcPr>
+          <w:p>
+            <w:pPr>
+              <w:spacing w:after="0" w:line="252" w:lineRule="auto"/>
+            </w:pPr>
+            <w:r/>
+            <w:r>
+              <w:rPr>
+                <w:rFonts w:ascii="Calibri" w:hAnsi="Calibri" w:eastAsia="Calibri"/>
+                <w:b w:val="0"/>
+                <w:sz w:val="18"/>
+              </w:rPr>
+              <w:t>GitHub Integration</w:t>
+            </w:r>
+          </w:p>
+        </w:tc>
+        <w:tc>
+          <w:tcPr>
+            <w:tcW w:type="dxa" w:w="6408"/>
+            <w:shd w:fill="FFFFFF"/>
+            <w:vAlign w:val="center"/>
+          </w:tcPr>
+          <w:p>
+            <w:pPr>
+              <w:spacing w:after="0" w:line="252" w:lineRule="auto"/>
+            </w:pPr>
+            <w:r/>
+            <w:r>
+              <w:rPr>
+                <w:rFonts w:ascii="Calibri" w:hAnsi="Calibri" w:eastAsia="Calibri"/>
+                <w:b w:val="0"/>
+                <w:sz w:val="18"/>
+              </w:rPr>
+              <w:t>Receive webhook metadata, parse conventional commits, link commits to tasks, and identify unlinked commits.</w:t>
+            </w:r>
+          </w:p>
+        </w:tc>
+      </w:tr>
+      <w:tr>
+        <w:tc>
+          <w:tcPr>
+            <w:tcW w:type="dxa" w:w="2951"/>
+            <w:shd w:fill="FFFFFF"/>
+            <w:vAlign w:val="center"/>
+          </w:tcPr>
+          <w:p>
+            <w:pPr>
+              <w:spacing w:after="0" w:line="252" w:lineRule="auto"/>
+            </w:pPr>
+            <w:r/>
+            <w:r>
+              <w:rPr>
+                <w:rFonts w:ascii="Calibri" w:hAnsi="Calibri" w:eastAsia="Calibri"/>
+                <w:b w:val="0"/>
+                <w:sz w:val="18"/>
+              </w:rPr>
+              <w:t>Contribution Analytics</w:t>
+            </w:r>
+          </w:p>
+        </w:tc>
+        <w:tc>
+          <w:tcPr>
+            <w:tcW w:type="dxa" w:w="6408"/>
+            <w:shd w:fill="FFFFFF"/>
+            <w:vAlign w:val="center"/>
+          </w:tcPr>
+          <w:p>
+            <w:pPr>
+              <w:spacing w:after="0" w:line="252" w:lineRule="auto"/>
+            </w:pPr>
+            <w:r/>
+            <w:r>
+              <w:rPr>
+                <w:rFonts w:ascii="Calibri" w:hAnsi="Calibri" w:eastAsia="Calibri"/>
+                <w:b w:val="0"/>
+                <w:sz w:val="18"/>
+              </w:rPr>
+              <w:t>Summarize contribution using task, evidence, testing, bug fixing, and GitHub activity signals.</w:t>
+            </w:r>
+          </w:p>
+        </w:tc>
+      </w:tr>
+    </w:tbl>
+    <w:p>
+      <w:pPr>
+        <w:spacing w:after="40"/>
+      </w:pPr>
+    </w:p>
+    <w:p>
+      <w:pPr>
+        <w:pStyle w:val="Heading2"/>
+      </w:pPr>
+      <w:r>
+        <w:t>2.2 Out-of-Scope / Future Scope</w:t>
+      </w:r>
+    </w:p>
+    <w:p>
+      <w:pPr>
+        <w:pStyle w:val="ListBullet"/>
+        <w:spacing w:after="80" w:line="264" w:lineRule="auto"/>
+      </w:pPr>
+      <w:r>
+        <w:rPr>
+          <w:rFonts w:ascii="Calibri" w:hAnsi="Calibri" w:eastAsia="Calibri"/>
+          <w:sz w:val="20"/>
+        </w:rPr>
+        <w:t>Deep AI code review or full repository scanning is not required for the MVP.</w:t>
+      </w:r>
+    </w:p>
+    <w:p>
+      <w:pPr>
+        <w:pStyle w:val="ListBullet"/>
+        <w:spacing w:after="80" w:line="264" w:lineRule="auto"/>
+      </w:pPr>
+      <w:r>
+        <w:rPr>
+          <w:rFonts w:ascii="Calibri" w:hAnsi="Calibri" w:eastAsia="Calibri"/>
+          <w:sz w:val="20"/>
+        </w:rPr>
+        <w:t>Advanced static analysis, security scanning, and automated grading are reserved for future phases.</w:t>
+      </w:r>
+    </w:p>
+    <w:p>
+      <w:pPr>
+        <w:pStyle w:val="ListBullet"/>
+        <w:spacing w:after="80" w:line="264" w:lineRule="auto"/>
+      </w:pPr>
+      <w:r>
+        <w:rPr>
+          <w:rFonts w:ascii="Calibri" w:hAnsi="Calibri" w:eastAsia="Calibri"/>
+          <w:sz w:val="20"/>
+        </w:rPr>
+        <w:t>Advanced PDF/Excel export, velocity analytics, burndown chart, and complex notification rules are future enhancements.</w:t>
+      </w:r>
+    </w:p>
+    <w:p>
+      <w:pPr>
+        <w:pStyle w:val="ListBullet"/>
+        <w:spacing w:after="80" w:line="264" w:lineRule="auto"/>
+      </w:pPr>
+      <w:r>
+        <w:rPr>
+          <w:rFonts w:ascii="Calibri" w:hAnsi="Calibri" w:eastAsia="Calibri"/>
+          <w:sz w:val="20"/>
+        </w:rPr>
+        <w:t>The system will not allow AI to automatically mark tasks as Done, accept evidence, or score team members without human review.</w:t>
+      </w:r>
+    </w:p>
+    <w:p>
+      <w:pPr>
+        <w:pStyle w:val="ListBullet"/>
+        <w:spacing w:after="80" w:line="264" w:lineRule="auto"/>
+      </w:pPr>
+      <w:r>
+        <w:rPr>
+          <w:rFonts w:ascii="Calibri" w:hAnsi="Calibri" w:eastAsia="Calibri"/>
+          <w:sz w:val="20"/>
+        </w:rPr>
+        <w:t>Payment, commercial booking, and non-academic project management features are outside the project scope.</w:t>
+      </w:r>
+    </w:p>
+    <w:p>
+      <w:pPr>
+        <w:pStyle w:val="Heading2"/>
+      </w:pPr>
+      <w:r>
+        <w:t>2.3 Scope Boundaries and Assumptions</w:t>
+      </w:r>
+    </w:p>
+    <w:p>
+      <w:pPr>
+        <w:spacing w:before="0" w:after="120" w:line="269" w:lineRule="auto"/>
+      </w:pPr>
+      <w:r>
+        <w:rPr>
+          <w:rFonts w:ascii="Calibri" w:hAnsi="Calibri" w:eastAsia="Calibri"/>
+          <w:sz w:val="21"/>
+        </w:rPr>
+        <w:t>The MVP should prioritize a reliable academic workflow over advanced automation. RTM status calculation should be rule-based first so that results are explainable and testable. AI-related features should operate as draft or suggestion mechanisms. GitHub integration should begin with webhook metadata and commit convention parsing instead of cloning and analyzing the entire source code repository.</w:t>
+      </w:r>
+    </w:p>
+    <w:p>
+      <w:pPr>
+        <w:pStyle w:val="Heading1"/>
+      </w:pPr>
+      <w:r>
+        <w:t>3. Existing Systems and Gap Analysis</w:t>
+      </w:r>
+    </w:p>
+    <w:p>
+      <w:pPr>
+        <w:spacing w:before="0" w:after="120" w:line="269" w:lineRule="auto"/>
+      </w:pPr>
+      <w:r>
+        <w:rPr>
+          <w:rFonts w:ascii="Calibri" w:hAnsi="Calibri" w:eastAsia="Calibri"/>
+          <w:sz w:val="21"/>
+        </w:rPr>
+        <w:t>Several existing tools can support parts of the project management process, but they do not fully solve the specific academic traceability and evidence needs of DevTrack AI. The following comparison summarizes the most relevant existing systems and their limitations for student software projects.</w:t>
+      </w:r>
+    </w:p>
+    <w:tbl>
+      <w:tblPr>
+        <w:tblStyle w:val="TableGrid"/>
+        <w:tblW w:type="auto" w:w="0"/>
+        <w:jc w:val="center"/>
+        <w:tblLayout w:type="fixed"/>
+        <w:tblLook w:firstColumn="1" w:firstRow="1" w:lastColumn="0" w:lastRow="0" w:noHBand="0" w:noVBand="1" w:val="04A0"/>
+      </w:tblPr>
+      <w:tblGrid>
+        <w:gridCol w:w="3264"/>
+        <w:gridCol w:w="3264"/>
+        <w:gridCol w:w="3264"/>
+      </w:tblGrid>
+      <w:tr>
+        <w:trPr>
+          <w:tblHeader w:val="true"/>
+        </w:trPr>
+        <w:tc>
+          <w:tcPr>
+            <w:tcW w:type="dxa" w:w="2015"/>
+            <w:shd w:fill="E8EEF5"/>
+            <w:vAlign w:val="center"/>
+          </w:tcPr>
+          <w:p>
+            <w:pPr>
+              <w:spacing w:after="0" w:line="252" w:lineRule="auto"/>
+            </w:pPr>
+            <w:r/>
+            <w:r>
+              <w:rPr>
+                <w:rFonts w:ascii="Calibri" w:hAnsi="Calibri" w:eastAsia="Calibri"/>
+                <w:b/>
+                <w:color w:val="0B2545"/>
+                <w:sz w:val="18"/>
+              </w:rPr>
+              <w:t>Existing System</w:t>
+            </w:r>
+          </w:p>
+        </w:tc>
+        <w:tc>
+          <w:tcPr>
+            <w:tcW w:type="dxa" w:w="3311"/>
+            <w:shd w:fill="E8EEF5"/>
+            <w:vAlign w:val="center"/>
+          </w:tcPr>
+          <w:p>
+            <w:pPr>
+              <w:spacing w:after="0" w:line="252" w:lineRule="auto"/>
+            </w:pPr>
+            <w:r/>
+            <w:r>
+              <w:rPr>
+                <w:rFonts w:ascii="Calibri" w:hAnsi="Calibri" w:eastAsia="Calibri"/>
+                <w:b/>
+                <w:color w:val="0B2545"/>
+                <w:sz w:val="18"/>
+              </w:rPr>
+              <w:t>Strengths</w:t>
+            </w:r>
+          </w:p>
+        </w:tc>
+        <w:tc>
+          <w:tcPr>
+            <w:tcW w:type="dxa" w:w="4031"/>
+            <w:shd w:fill="E8EEF5"/>
+            <w:vAlign w:val="center"/>
+          </w:tcPr>
+          <w:p>
+            <w:pPr>
+              <w:spacing w:after="0" w:line="252" w:lineRule="auto"/>
+            </w:pPr>
+            <w:r/>
+            <w:r>
+              <w:rPr>
+                <w:rFonts w:ascii="Calibri" w:hAnsi="Calibri" w:eastAsia="Calibri"/>
+                <w:b/>
+                <w:color w:val="0B2545"/>
+                <w:sz w:val="18"/>
+              </w:rPr>
+              <w:t>Limitations for This Project</w:t>
+            </w:r>
+          </w:p>
+        </w:tc>
+      </w:tr>
+      <w:tr>
+        <w:tc>
+          <w:tcPr>
+            <w:tcW w:type="dxa" w:w="2015"/>
+            <w:shd w:fill="FFFFFF"/>
+            <w:vAlign w:val="center"/>
+          </w:tcPr>
+          <w:p>
+            <w:pPr>
+              <w:spacing w:after="0" w:line="252" w:lineRule="auto"/>
+            </w:pPr>
+            <w:r/>
+            <w:r>
+              <w:rPr>
+                <w:rFonts w:ascii="Calibri" w:hAnsi="Calibri" w:eastAsia="Calibri"/>
+                <w:b w:val="0"/>
+                <w:sz w:val="18"/>
+              </w:rPr>
+              <w:t>Jira</w:t>
+            </w:r>
+          </w:p>
+        </w:tc>
+        <w:tc>
+          <w:tcPr>
+            <w:tcW w:type="dxa" w:w="3311"/>
+            <w:shd w:fill="FFFFFF"/>
+            <w:vAlign w:val="center"/>
+          </w:tcPr>
+          <w:p>
+            <w:pPr>
+              <w:spacing w:after="0" w:line="252" w:lineRule="auto"/>
+            </w:pPr>
+            <w:r/>
+            <w:r>
+              <w:rPr>
+                <w:rFonts w:ascii="Calibri" w:hAnsi="Calibri" w:eastAsia="Calibri"/>
+                <w:b w:val="0"/>
+                <w:sz w:val="18"/>
+              </w:rPr>
+              <w:t>Strong issue tracking, agile board, sprint management, workflow customization.</w:t>
+            </w:r>
+          </w:p>
+        </w:tc>
+        <w:tc>
+          <w:tcPr>
+            <w:tcW w:type="dxa" w:w="4031"/>
+            <w:shd w:fill="FFFFFF"/>
+            <w:vAlign w:val="center"/>
+          </w:tcPr>
+          <w:p>
+            <w:pPr>
+              <w:spacing w:after="0" w:line="252" w:lineRule="auto"/>
+            </w:pPr>
+            <w:r/>
+            <w:r>
+              <w:rPr>
+                <w:rFonts w:ascii="Calibri" w:hAnsi="Calibri" w:eastAsia="Calibri"/>
+                <w:b w:val="0"/>
+                <w:sz w:val="18"/>
+              </w:rPr>
+              <w:t>Designed for professional issue tracking; requirement-to-test-to-evidence traceability and academic evidence review are not central by default.</w:t>
+            </w:r>
+          </w:p>
+        </w:tc>
+      </w:tr>
+      <w:tr>
+        <w:tc>
+          <w:tcPr>
+            <w:tcW w:type="dxa" w:w="2015"/>
+            <w:shd w:fill="FFFFFF"/>
+            <w:vAlign w:val="center"/>
+          </w:tcPr>
+          <w:p>
+            <w:pPr>
+              <w:spacing w:after="0" w:line="252" w:lineRule="auto"/>
+            </w:pPr>
+            <w:r/>
+            <w:r>
+              <w:rPr>
+                <w:rFonts w:ascii="Calibri" w:hAnsi="Calibri" w:eastAsia="Calibri"/>
+                <w:b w:val="0"/>
+                <w:sz w:val="18"/>
+              </w:rPr>
+              <w:t>Trello</w:t>
+            </w:r>
+          </w:p>
+        </w:tc>
+        <w:tc>
+          <w:tcPr>
+            <w:tcW w:type="dxa" w:w="3311"/>
+            <w:shd w:fill="FFFFFF"/>
+            <w:vAlign w:val="center"/>
+          </w:tcPr>
+          <w:p>
+            <w:pPr>
+              <w:spacing w:after="0" w:line="252" w:lineRule="auto"/>
+            </w:pPr>
+            <w:r/>
+            <w:r>
+              <w:rPr>
+                <w:rFonts w:ascii="Calibri" w:hAnsi="Calibri" w:eastAsia="Calibri"/>
+                <w:b w:val="0"/>
+                <w:sz w:val="18"/>
+              </w:rPr>
+              <w:t>Simple Kanban board, easy for students to learn, lightweight task movement.</w:t>
+            </w:r>
+          </w:p>
+        </w:tc>
+        <w:tc>
+          <w:tcPr>
+            <w:tcW w:type="dxa" w:w="4031"/>
+            <w:shd w:fill="FFFFFF"/>
+            <w:vAlign w:val="center"/>
+          </w:tcPr>
+          <w:p>
+            <w:pPr>
+              <w:spacing w:after="0" w:line="252" w:lineRule="auto"/>
+            </w:pPr>
+            <w:r/>
+            <w:r>
+              <w:rPr>
+                <w:rFonts w:ascii="Calibri" w:hAnsi="Calibri" w:eastAsia="Calibri"/>
+                <w:b w:val="0"/>
+                <w:sz w:val="18"/>
+              </w:rPr>
+              <w:t>Good for visual task tracking but weak for requirement traceability, test coverage, evidence validation, and formal reporting.</w:t>
+            </w:r>
+          </w:p>
+        </w:tc>
+      </w:tr>
+      <w:tr>
+        <w:tc>
+          <w:tcPr>
+            <w:tcW w:type="dxa" w:w="2015"/>
+            <w:shd w:fill="FFFFFF"/>
+            <w:vAlign w:val="center"/>
+          </w:tcPr>
+          <w:p>
+            <w:pPr>
+              <w:spacing w:after="0" w:line="252" w:lineRule="auto"/>
+            </w:pPr>
+            <w:r/>
+            <w:r>
+              <w:rPr>
+                <w:rFonts w:ascii="Calibri" w:hAnsi="Calibri" w:eastAsia="Calibri"/>
+                <w:b w:val="0"/>
+                <w:sz w:val="18"/>
+              </w:rPr>
+              <w:t>GitHub Projects</w:t>
+            </w:r>
+          </w:p>
+        </w:tc>
+        <w:tc>
+          <w:tcPr>
+            <w:tcW w:type="dxa" w:w="3311"/>
+            <w:shd w:fill="FFFFFF"/>
+            <w:vAlign w:val="center"/>
+          </w:tcPr>
+          <w:p>
+            <w:pPr>
+              <w:spacing w:after="0" w:line="252" w:lineRule="auto"/>
+            </w:pPr>
+            <w:r/>
+            <w:r>
+              <w:rPr>
+                <w:rFonts w:ascii="Calibri" w:hAnsi="Calibri" w:eastAsia="Calibri"/>
+                <w:b w:val="0"/>
+                <w:sz w:val="18"/>
+              </w:rPr>
+              <w:t>Close to source code, issues, pull requests, commits, and repository activity.</w:t>
+            </w:r>
+          </w:p>
+        </w:tc>
+        <w:tc>
+          <w:tcPr>
+            <w:tcW w:type="dxa" w:w="4031"/>
+            <w:shd w:fill="FFFFFF"/>
+            <w:vAlign w:val="center"/>
+          </w:tcPr>
+          <w:p>
+            <w:pPr>
+              <w:spacing w:after="0" w:line="252" w:lineRule="auto"/>
+            </w:pPr>
+            <w:r/>
+            <w:r>
+              <w:rPr>
+                <w:rFonts w:ascii="Calibri" w:hAnsi="Calibri" w:eastAsia="Calibri"/>
+                <w:b w:val="0"/>
+                <w:sz w:val="18"/>
+              </w:rPr>
+              <w:t>Useful for development tracking but does not provide complete academic RTM, accepted evidence logic, mentor review workflow, or AI report governance.</w:t>
+            </w:r>
+          </w:p>
+        </w:tc>
+      </w:tr>
+      <w:tr>
+        <w:tc>
+          <w:tcPr>
+            <w:tcW w:type="dxa" w:w="2015"/>
+            <w:shd w:fill="FFFFFF"/>
+            <w:vAlign w:val="center"/>
+          </w:tcPr>
+          <w:p>
+            <w:pPr>
+              <w:spacing w:after="0" w:line="252" w:lineRule="auto"/>
+            </w:pPr>
+            <w:r/>
+            <w:r>
+              <w:rPr>
+                <w:rFonts w:ascii="Calibri" w:hAnsi="Calibri" w:eastAsia="Calibri"/>
+                <w:b w:val="0"/>
+                <w:sz w:val="18"/>
+              </w:rPr>
+              <w:t>Notion / Google Sheets</w:t>
+            </w:r>
+          </w:p>
+        </w:tc>
+        <w:tc>
+          <w:tcPr>
+            <w:tcW w:type="dxa" w:w="3311"/>
+            <w:shd w:fill="FFFFFF"/>
+            <w:vAlign w:val="center"/>
+          </w:tcPr>
+          <w:p>
+            <w:pPr>
+              <w:spacing w:after="0" w:line="252" w:lineRule="auto"/>
+            </w:pPr>
+            <w:r/>
+            <w:r>
+              <w:rPr>
+                <w:rFonts w:ascii="Calibri" w:hAnsi="Calibri" w:eastAsia="Calibri"/>
+                <w:b w:val="0"/>
+                <w:sz w:val="18"/>
+              </w:rPr>
+              <w:t>Flexible documentation and manual tracking, easy collaboration.</w:t>
+            </w:r>
+          </w:p>
+        </w:tc>
+        <w:tc>
+          <w:tcPr>
+            <w:tcW w:type="dxa" w:w="4031"/>
+            <w:shd w:fill="FFFFFF"/>
+            <w:vAlign w:val="center"/>
+          </w:tcPr>
+          <w:p>
+            <w:pPr>
+              <w:spacing w:after="0" w:line="252" w:lineRule="auto"/>
+            </w:pPr>
+            <w:r/>
+            <w:r>
+              <w:rPr>
+                <w:rFonts w:ascii="Calibri" w:hAnsi="Calibri" w:eastAsia="Calibri"/>
+                <w:b w:val="0"/>
+                <w:sz w:val="18"/>
+              </w:rPr>
+              <w:t>Highly manual; data consistency, permission control, trace link validation, and automated reporting are difficult to maintain.</w:t>
+            </w:r>
+          </w:p>
+        </w:tc>
+      </w:tr>
+      <w:tr>
+        <w:tc>
+          <w:tcPr>
+            <w:tcW w:type="dxa" w:w="2015"/>
+            <w:shd w:fill="FFFFFF"/>
+            <w:vAlign w:val="center"/>
+          </w:tcPr>
+          <w:p>
+            <w:pPr>
+              <w:spacing w:after="0" w:line="252" w:lineRule="auto"/>
+            </w:pPr>
+            <w:r/>
+            <w:r>
+              <w:rPr>
+                <w:rFonts w:ascii="Calibri" w:hAnsi="Calibri" w:eastAsia="Calibri"/>
+                <w:b w:val="0"/>
+                <w:sz w:val="18"/>
+              </w:rPr>
+              <w:t>LMS / Course Submission Tools</w:t>
+            </w:r>
+          </w:p>
+        </w:tc>
+        <w:tc>
+          <w:tcPr>
+            <w:tcW w:type="dxa" w:w="3311"/>
+            <w:shd w:fill="FFFFFF"/>
+            <w:vAlign w:val="center"/>
+          </w:tcPr>
+          <w:p>
+            <w:pPr>
+              <w:spacing w:after="0" w:line="252" w:lineRule="auto"/>
+            </w:pPr>
+            <w:r/>
+            <w:r>
+              <w:rPr>
+                <w:rFonts w:ascii="Calibri" w:hAnsi="Calibri" w:eastAsia="Calibri"/>
+                <w:b w:val="0"/>
+                <w:sz w:val="18"/>
+              </w:rPr>
+              <w:t>Suitable for submitting final files and receiving instructor feedback.</w:t>
+            </w:r>
+          </w:p>
+        </w:tc>
+        <w:tc>
+          <w:tcPr>
+            <w:tcW w:type="dxa" w:w="4031"/>
+            <w:shd w:fill="FFFFFF"/>
+            <w:vAlign w:val="center"/>
+          </w:tcPr>
+          <w:p>
+            <w:pPr>
+              <w:spacing w:after="0" w:line="252" w:lineRule="auto"/>
+            </w:pPr>
+            <w:r/>
+            <w:r>
+              <w:rPr>
+                <w:rFonts w:ascii="Calibri" w:hAnsi="Calibri" w:eastAsia="Calibri"/>
+                <w:b w:val="0"/>
+                <w:sz w:val="18"/>
+              </w:rPr>
+              <w:t>Usually focused on final submission rather than day-to-day requirement, task, test, evidence, and GitHub traceability.</w:t>
+            </w:r>
+          </w:p>
+        </w:tc>
+      </w:tr>
+    </w:tbl>
+    <w:p>
+      <w:pPr>
+        <w:spacing w:after="40"/>
+      </w:pPr>
+    </w:p>
+    <w:p>
+      <w:pPr>
+        <w:pStyle w:val="Heading2"/>
+      </w:pPr>
+      <w:r>
+        <w:t>3.1 Key Gaps Identified</w:t>
+      </w:r>
+    </w:p>
+    <w:p>
+      <w:pPr>
+        <w:pStyle w:val="ListBullet"/>
+        <w:spacing w:after="80" w:line="264" w:lineRule="auto"/>
+      </w:pPr>
+      <w:r>
+        <w:rPr>
+          <w:rFonts w:ascii="Calibri" w:hAnsi="Calibri" w:eastAsia="Calibri"/>
+          <w:sz w:val="20"/>
+        </w:rPr>
+        <w:t>Existing tools often track tasks but do not clearly prove whether each requirement is implemented, tested, and supported by accepted evidence.</w:t>
+      </w:r>
+    </w:p>
+    <w:p>
+      <w:pPr>
+        <w:pStyle w:val="ListBullet"/>
+        <w:spacing w:after="80" w:line="264" w:lineRule="auto"/>
+      </w:pPr>
+      <w:r>
+        <w:rPr>
+          <w:rFonts w:ascii="Calibri" w:hAnsi="Calibri" w:eastAsia="Calibri"/>
+          <w:sz w:val="20"/>
+        </w:rPr>
+        <w:t>Testing artifacts and bug reports are often separated from requirement and task management.</w:t>
+      </w:r>
+    </w:p>
+    <w:p>
+      <w:pPr>
+        <w:pStyle w:val="ListBullet"/>
+        <w:spacing w:after="80" w:line="264" w:lineRule="auto"/>
+      </w:pPr>
+      <w:r>
+        <w:rPr>
+          <w:rFonts w:ascii="Calibri" w:hAnsi="Calibri" w:eastAsia="Calibri"/>
+          <w:sz w:val="20"/>
+        </w:rPr>
+        <w:t>Evidence is usually uploaded as links or files without a formal review status such as Pending, Accepted, Rejected, or Needs Clarification.</w:t>
+      </w:r>
+    </w:p>
+    <w:p>
+      <w:pPr>
+        <w:pStyle w:val="ListBullet"/>
+        <w:spacing w:after="80" w:line="264" w:lineRule="auto"/>
+      </w:pPr>
+      <w:r>
+        <w:rPr>
+          <w:rFonts w:ascii="Calibri" w:hAnsi="Calibri" w:eastAsia="Calibri"/>
+          <w:sz w:val="20"/>
+        </w:rPr>
+        <w:t>GitHub activity is rarely linked back to project requirements or tasks unless the team manually enforces conventions.</w:t>
+      </w:r>
+    </w:p>
+    <w:p>
+      <w:pPr>
+        <w:pStyle w:val="ListBullet"/>
+        <w:spacing w:after="80" w:line="264" w:lineRule="auto"/>
+      </w:pPr>
+      <w:r>
+        <w:rPr>
+          <w:rFonts w:ascii="Calibri" w:hAnsi="Calibri" w:eastAsia="Calibri"/>
+          <w:sz w:val="20"/>
+        </w:rPr>
+        <w:t>AI usage is not usually logged, reviewed, or connected to academic reflection, which can reduce transparency in student projects.</w:t>
+      </w:r>
+    </w:p>
+    <w:p>
+      <w:pPr>
+        <w:pStyle w:val="Heading1"/>
+      </w:pPr>
+      <w:r>
+        <w:t>4. Proposed System Summary</w:t>
+      </w:r>
+    </w:p>
+    <w:p>
+      <w:pPr>
+        <w:spacing w:before="0" w:after="120" w:line="269" w:lineRule="auto"/>
+      </w:pPr>
+      <w:r>
+        <w:rPr>
+          <w:rFonts w:ascii="Calibri" w:hAnsi="Calibri" w:eastAsia="Calibri"/>
+          <w:sz w:val="21"/>
+        </w:rPr>
+        <w:t>DevTrack AI is proposed as a focused academic project workspace that combines project management, requirement traceability, evidence validation, testing visibility, GitHub metadata, and AI-assisted reporting. The system should keep official project state under human control while using AI to suggest, summarize, and highlight missing information.</w:t>
+      </w:r>
+    </w:p>
+    <w:tbl>
+      <w:tblPr>
+        <w:tblStyle w:val="TableGrid"/>
+        <w:tblW w:type="auto" w:w="0"/>
+        <w:jc w:val="center"/>
+        <w:tblLayout w:type="fixed"/>
+        <w:tblLook w:firstColumn="1" w:firstRow="1" w:lastColumn="0" w:lastRow="0" w:noHBand="0" w:noVBand="1" w:val="04A0"/>
+      </w:tblPr>
+      <w:tblGrid>
+        <w:gridCol w:w="4896"/>
+        <w:gridCol w:w="4896"/>
+      </w:tblGrid>
+      <w:tr>
+        <w:trPr>
+          <w:tblHeader w:val="true"/>
+        </w:trPr>
+        <w:tc>
+          <w:tcPr>
+            <w:tcW w:type="dxa" w:w="2448"/>
+            <w:shd w:fill="E8EEF5"/>
+            <w:vAlign w:val="center"/>
+          </w:tcPr>
+          <w:p>
+            <w:pPr>
+              <w:spacing w:after="0" w:line="252" w:lineRule="auto"/>
+            </w:pPr>
+            <w:r/>
+            <w:r>
+              <w:rPr>
+                <w:rFonts w:ascii="Calibri" w:hAnsi="Calibri" w:eastAsia="Calibri"/>
+                <w:b/>
+                <w:color w:val="0B2545"/>
+                <w:sz w:val="18"/>
+              </w:rPr>
+              <w:t>Need</w:t>
+            </w:r>
+          </w:p>
+        </w:tc>
+        <w:tc>
+          <w:tcPr>
+            <w:tcW w:type="dxa" w:w="6912"/>
+            <w:shd w:fill="E8EEF5"/>
+            <w:vAlign w:val="center"/>
+          </w:tcPr>
+          <w:p>
+            <w:pPr>
+              <w:spacing w:after="0" w:line="252" w:lineRule="auto"/>
+            </w:pPr>
+            <w:r/>
+            <w:r>
+              <w:rPr>
+                <w:rFonts w:ascii="Calibri" w:hAnsi="Calibri" w:eastAsia="Calibri"/>
+                <w:b/>
+                <w:color w:val="0B2545"/>
+                <w:sz w:val="18"/>
+              </w:rPr>
+              <w:t>DevTrack AI Response</w:t>
+            </w:r>
+          </w:p>
+        </w:tc>
+      </w:tr>
+      <w:tr>
+        <w:tc>
+          <w:tcPr>
+            <w:tcW w:type="dxa" w:w="2448"/>
+            <w:shd w:fill="FFFFFF"/>
+            <w:vAlign w:val="center"/>
+          </w:tcPr>
+          <w:p>
+            <w:pPr>
+              <w:spacing w:after="0" w:line="252" w:lineRule="auto"/>
+            </w:pPr>
+            <w:r/>
+            <w:r>
+              <w:rPr>
+                <w:rFonts w:ascii="Calibri" w:hAnsi="Calibri" w:eastAsia="Calibri"/>
+                <w:b w:val="0"/>
+                <w:sz w:val="18"/>
+              </w:rPr>
+              <w:t>Traceability</w:t>
+            </w:r>
+          </w:p>
+        </w:tc>
+        <w:tc>
+          <w:tcPr>
+            <w:tcW w:type="dxa" w:w="6912"/>
+            <w:shd w:fill="FFFFFF"/>
+            <w:vAlign w:val="center"/>
+          </w:tcPr>
+          <w:p>
+            <w:pPr>
+              <w:spacing w:after="0" w:line="252" w:lineRule="auto"/>
+            </w:pPr>
+            <w:r/>
+            <w:r>
+              <w:rPr>
+                <w:rFonts w:ascii="Calibri" w:hAnsi="Calibri" w:eastAsia="Calibri"/>
+                <w:b w:val="0"/>
+                <w:sz w:val="18"/>
+              </w:rPr>
+              <w:t>Connect Requirement -&gt; Use Case -&gt; Task -&gt; Test Case -&gt; Bug/Defect -&gt; Evidence -&gt; RTM -&gt; Report.</w:t>
+            </w:r>
+          </w:p>
+        </w:tc>
+      </w:tr>
+      <w:tr>
+        <w:tc>
+          <w:tcPr>
+            <w:tcW w:type="dxa" w:w="2448"/>
+            <w:shd w:fill="FFFFFF"/>
+            <w:vAlign w:val="center"/>
+          </w:tcPr>
+          <w:p>
+            <w:pPr>
+              <w:spacing w:after="0" w:line="252" w:lineRule="auto"/>
+            </w:pPr>
+            <w:r/>
+            <w:r>
+              <w:rPr>
+                <w:rFonts w:ascii="Calibri" w:hAnsi="Calibri" w:eastAsia="Calibri"/>
+                <w:b w:val="0"/>
+                <w:sz w:val="18"/>
+              </w:rPr>
+              <w:t>Evidence-based progress</w:t>
+            </w:r>
+          </w:p>
+        </w:tc>
+        <w:tc>
+          <w:tcPr>
+            <w:tcW w:type="dxa" w:w="6912"/>
+            <w:shd w:fill="FFFFFF"/>
+            <w:vAlign w:val="center"/>
+          </w:tcPr>
+          <w:p>
+            <w:pPr>
+              <w:spacing w:after="0" w:line="252" w:lineRule="auto"/>
+            </w:pPr>
+            <w:r/>
+            <w:r>
+              <w:rPr>
+                <w:rFonts w:ascii="Calibri" w:hAnsi="Calibri" w:eastAsia="Calibri"/>
+                <w:b w:val="0"/>
+                <w:sz w:val="18"/>
+              </w:rPr>
+              <w:t>Require evidence review and count only accepted evidence in RTM completion logic.</w:t>
+            </w:r>
+          </w:p>
+        </w:tc>
+      </w:tr>
+      <w:tr>
+        <w:tc>
+          <w:tcPr>
+            <w:tcW w:type="dxa" w:w="2448"/>
+            <w:shd w:fill="FFFFFF"/>
+            <w:vAlign w:val="center"/>
+          </w:tcPr>
+          <w:p>
+            <w:pPr>
+              <w:spacing w:after="0" w:line="252" w:lineRule="auto"/>
+            </w:pPr>
+            <w:r/>
+            <w:r>
+              <w:rPr>
+                <w:rFonts w:ascii="Calibri" w:hAnsi="Calibri" w:eastAsia="Calibri"/>
+                <w:b w:val="0"/>
+                <w:sz w:val="18"/>
+              </w:rPr>
+              <w:t>Mentor visibility</w:t>
+            </w:r>
+          </w:p>
+        </w:tc>
+        <w:tc>
+          <w:tcPr>
+            <w:tcW w:type="dxa" w:w="6912"/>
+            <w:shd w:fill="FFFFFF"/>
+            <w:vAlign w:val="center"/>
+          </w:tcPr>
+          <w:p>
+            <w:pPr>
+              <w:spacing w:after="0" w:line="252" w:lineRule="auto"/>
+            </w:pPr>
+            <w:r/>
+            <w:r>
+              <w:rPr>
+                <w:rFonts w:ascii="Calibri" w:hAnsi="Calibri" w:eastAsia="Calibri"/>
+                <w:b w:val="0"/>
+                <w:sz w:val="18"/>
+              </w:rPr>
+              <w:t>Provide read-only overview, RTM, evidence, weekly reports, and contribution indicators.</w:t>
+            </w:r>
+          </w:p>
+        </w:tc>
+      </w:tr>
+      <w:tr>
+        <w:tc>
+          <w:tcPr>
+            <w:tcW w:type="dxa" w:w="2448"/>
+            <w:shd w:fill="FFFFFF"/>
+            <w:vAlign w:val="center"/>
+          </w:tcPr>
+          <w:p>
+            <w:pPr>
+              <w:spacing w:after="0" w:line="252" w:lineRule="auto"/>
+            </w:pPr>
+            <w:r/>
+            <w:r>
+              <w:rPr>
+                <w:rFonts w:ascii="Calibri" w:hAnsi="Calibri" w:eastAsia="Calibri"/>
+                <w:b w:val="0"/>
+                <w:sz w:val="18"/>
+              </w:rPr>
+              <w:t>AI transparency</w:t>
+            </w:r>
+          </w:p>
+        </w:tc>
+        <w:tc>
+          <w:tcPr>
+            <w:tcW w:type="dxa" w:w="6912"/>
+            <w:shd w:fill="FFFFFF"/>
+            <w:vAlign w:val="center"/>
+          </w:tcPr>
+          <w:p>
+            <w:pPr>
+              <w:spacing w:after="0" w:line="252" w:lineRule="auto"/>
+            </w:pPr>
+            <w:r/>
+            <w:r>
+              <w:rPr>
+                <w:rFonts w:ascii="Calibri" w:hAnsi="Calibri" w:eastAsia="Calibri"/>
+                <w:b w:val="0"/>
+                <w:sz w:val="18"/>
+              </w:rPr>
+              <w:t>Treat AI output as draft and require user review before applying it to official project data.</w:t>
+            </w:r>
+          </w:p>
+        </w:tc>
+      </w:tr>
+      <w:tr>
+        <w:tc>
+          <w:tcPr>
+            <w:tcW w:type="dxa" w:w="2448"/>
+            <w:shd w:fill="FFFFFF"/>
+            <w:vAlign w:val="center"/>
+          </w:tcPr>
+          <w:p>
+            <w:pPr>
+              <w:spacing w:after="0" w:line="252" w:lineRule="auto"/>
+            </w:pPr>
+            <w:r/>
+            <w:r>
+              <w:rPr>
+                <w:rFonts w:ascii="Calibri" w:hAnsi="Calibri" w:eastAsia="Calibri"/>
+                <w:b w:val="0"/>
+                <w:sz w:val="18"/>
+              </w:rPr>
+              <w:t>Code insight</w:t>
+            </w:r>
+          </w:p>
+        </w:tc>
+        <w:tc>
+          <w:tcPr>
+            <w:tcW w:type="dxa" w:w="6912"/>
+            <w:shd w:fill="FFFFFF"/>
+            <w:vAlign w:val="center"/>
+          </w:tcPr>
+          <w:p>
+            <w:pPr>
+              <w:spacing w:after="0" w:line="252" w:lineRule="auto"/>
+            </w:pPr>
+            <w:r/>
+            <w:r>
+              <w:rPr>
+                <w:rFonts w:ascii="Calibri" w:hAnsi="Calibri" w:eastAsia="Calibri"/>
+                <w:b w:val="0"/>
+                <w:sz w:val="18"/>
+              </w:rPr>
+              <w:t>Use GitHub webhook metadata and conventional commit parsing to link code activity with project artifacts.</w:t>
+            </w:r>
+          </w:p>
+        </w:tc>
+      </w:tr>
+    </w:tbl>
+    <w:p>
+      <w:pPr>
+        <w:spacing w:after="40"/>
+      </w:pPr>
+    </w:p>
     <w:sectPr>
       <w:headerReference w:type="default" r:id="rId8"/>
       <w:footerReference w:type="default" r:id="rId9"/>
@@ -2117,7 +4108,7 @@
       <w:outlineLvl w:val="0"/>
     </w:pPr>
     <w:rPr>
-      <w:rFonts w:asciiTheme="majorHAnsi" w:eastAsiaTheme="majorEastAsia" w:hAnsiTheme="majorHAnsi" w:cstheme="majorBidi"/>
+      <w:rFonts w:asciiTheme="majorHAnsi" w:eastAsiaTheme="majorEastAsia" w:hAnsiTheme="majorHAnsi" w:cstheme="majorBidi" w:ascii="Calibri" w:hAnsi="Calibri"/>
       <w:b/>
       <w:bCs/>
       <w:color w:val="1F4E79"/>
@@ -2137,11 +4128,11 @@
     <w:pPr>
       <w:keepNext/>
       <w:keepLines/>
-      <w:spacing w:before="240"/>
+      <w:spacing w:before="240" w:after="120"/>
       <w:outlineLvl w:val="1"/>
     </w:pPr>
     <w:rPr>
-      <w:rFonts w:asciiTheme="majorHAnsi" w:eastAsiaTheme="majorEastAsia" w:hAnsiTheme="majorHAnsi" w:cstheme="majorBidi"/>
+      <w:rFonts w:asciiTheme="majorHAnsi" w:eastAsiaTheme="majorEastAsia" w:hAnsiTheme="majorHAnsi" w:cstheme="majorBidi" w:ascii="Calibri" w:hAnsi="Calibri"/>
       <w:b/>
       <w:bCs/>
       <w:color w:val="1F4E79"/>
@@ -2165,7 +4156,7 @@
       <w:outlineLvl w:val="2"/>
     </w:pPr>
     <w:rPr>
-      <w:rFonts w:asciiTheme="majorHAnsi" w:eastAsiaTheme="majorEastAsia" w:hAnsiTheme="majorHAnsi" w:cstheme="majorBidi"/>
+      <w:rFonts w:asciiTheme="majorHAnsi" w:eastAsiaTheme="majorEastAsia" w:hAnsiTheme="majorHAnsi" w:cstheme="majorBidi" w:ascii="Calibri" w:hAnsi="Calibri"/>
       <w:b/>
       <w:bCs/>
       <w:color w:val="0B2545"/>

</xml_diff>